<commit_message>
Phase 5 retail chain, ingestion engine, and theory library updates
Co-authored-by: Cursor <cursoragent@cursor.com>
</commit_message>
<xml_diff>
--- a/stock-quant-system/docs/manuals/开发者使用说明书.docx
+++ b/stock-quant-system/docs/manuals/开发者使用说明书.docx
@@ -53,7 +53,7 @@
                 <w:color w:val="D6DEE8"/>
                 <w:sz w:val="24"/>
               </w:rPr>
-              <w:t>架构 · 运维 · 模型生命周期 · 制度边界 · LLM 选型</w:t>
+              <w:t>架构 · 运维 · 模型生命周期 · 制度边界 · LLM · 开发 Skill</w:t>
             </w:r>
           </w:p>
         </w:tc>
@@ -72,7 +72,7 @@
           <w:color w:val="5A626E"/>
           <w:sz w:val="22"/>
         </w:rPr>
-        <w:t>版本 1.0    编写日期 2026-08-26</w:t>
+        <w:t>版本 1.1    编写日期 2026-08-26</w:t>
       </w:r>
     </w:p>
     <w:p>
@@ -102,7 +102,7 @@
           <w:color w:val="5A626E"/>
           <w:sz w:val="22"/>
         </w:rPr>
-        <w:t>强制规则：.cursor/rules/quant-dev-loop.mdc 与 vibe-coding-ethics.mdc</w:t>
+        <w:t>强制规则：.cursor/rules/*.mdc 与 .cursor/skills/yanheng-dev-loop/</w:t>
       </w:r>
     </w:p>
     <w:p/>
@@ -648,7 +648,7 @@
                 <w:color w:val="212529"/>
                 <w:sz w:val="20"/>
               </w:rPr>
-              <w:t>无。脚本手动跑</w:t>
+              <w:t>无自动流水线；GitHub 远程 github.com/DomenRaven/yanheng</w:t>
             </w:r>
           </w:p>
         </w:tc>
@@ -672,7 +672,7 @@
                 <w:color w:val="212529"/>
                 <w:sz w:val="20"/>
               </w:rPr>
-              <w:t>没有测试门禁流水线，也没有 git remote</w:t>
+              <w:t>没有测试门禁流水线，push 仍手工</w:t>
             </w:r>
           </w:p>
         </w:tc>
@@ -1143,6 +1143,21 @@
           <w:sz w:val="22"/>
         </w:rPr>
         <w:t>八荣八耻第 7 条要求把不确定写出来。各 phase 验收报告的「已知局限」章节是制度的证据，删掉它们等于拆制度。</w:t>
+      </w:r>
+    </w:p>
+    <w:p>
+      <w:pPr>
+        <w:pStyle w:val="ListBullet"/>
+      </w:pPr>
+      <w:r>
+        <w:rPr>
+          <w:rFonts w:ascii="Calibri" w:hAnsi="Calibri" w:eastAsia="微软雅黑" w:cs="Calibri"/>
+          <w:b w:val="0"/>
+          <w:i w:val="0"/>
+          <w:color w:val="212529"/>
+          <w:sz w:val="22"/>
+        </w:rPr>
+        <w:t>Agent 执行时加载项目 Skill：.cursor/skills/yanheng-dev-loop/（SKILL.md + eight-gates.md + eight-honors.md）。规则原文禁止改写八荣八耻的八句话。</w:t>
       </w:r>
     </w:p>
     <w:p>
@@ -2225,6 +2240,119 @@
     </w:p>
     <w:p>
       <w:pPr>
+        <w:pStyle w:val="Heading2"/>
+      </w:pPr>
+      <w:r>
+        <w:t>5.1 训练在做什么、怎么防过拟合</w:t>
+      </w:r>
+    </w:p>
+    <w:p>
+      <w:pPr>
+        <w:spacing w:after="160" w:line="360" w:lineRule="auto"/>
+      </w:pPr>
+      <w:r>
+        <w:rPr>
+          <w:rFonts w:ascii="Calibri" w:hAnsi="Calibri" w:eastAsia="微软雅黑" w:cs="Calibri"/>
+          <w:b w:val="0"/>
+          <w:i w:val="0"/>
+          <w:color w:val="212529"/>
+          <w:sz w:val="22"/>
+        </w:rPr>
+        <w:t>生产模型是 LightGBM LambdaRank，不是回归预测涨跌幅。每个月末截面把股票排成相对名次；相关性标签来自三重障碍（先触 +8% / -8% / 最多 20 个交易日），映射到 {0,1,2}。特征是 13 个点时因子；同一天的全部股票必须分在同一折（按日期切分，不是按行随机切）。</w:t>
+      </w:r>
+    </w:p>
+    <w:p>
+      <w:pPr>
+        <w:pStyle w:val="ListBullet"/>
+      </w:pPr>
+      <w:r>
+        <w:rPr>
+          <w:rFonts w:ascii="Calibri" w:hAnsi="Calibri" w:eastAsia="微软雅黑" w:cs="Calibri"/>
+          <w:b w:val="0"/>
+          <w:i w:val="0"/>
+          <w:color w:val="212529"/>
+          <w:sz w:val="22"/>
+        </w:rPr>
+        <w:t>标签与特征时间箭头：因子只用截面日及之前；标签看截面日之后最多 20 日路径。</w:t>
+      </w:r>
+    </w:p>
+    <w:p>
+      <w:pPr>
+        <w:pStyle w:val="ListBullet"/>
+      </w:pPr>
+      <w:r>
+        <w:rPr>
+          <w:rFonts w:ascii="Calibri" w:hAnsi="Calibri" w:eastAsia="微软雅黑" w:cs="Calibri"/>
+          <w:b w:val="0"/>
+          <w:i w:val="0"/>
+          <w:color w:val="212529"/>
+          <w:sz w:val="22"/>
+        </w:rPr>
+        <w:t>验证：Purged K-Fold + Embargo 防标签区间重叠泄漏；Walk-Forward expanding 才是部署口径（当前 OOS RankIC 均值 0.0608）。Purged K-Fold 会偏高，报告里两套都写、以 WF 为准。</w:t>
+      </w:r>
+    </w:p>
+    <w:p>
+      <w:pPr>
+        <w:pStyle w:val="ListBullet"/>
+      </w:pPr>
+      <w:r>
+        <w:rPr>
+          <w:rFonts w:ascii="Calibri" w:hAnsi="Calibri" w:eastAsia="微软雅黑" w:cs="Calibri"/>
+          <w:b w:val="0"/>
+          <w:i w:val="0"/>
+          <w:color w:val="212529"/>
+          <w:sz w:val="22"/>
+        </w:rPr>
+        <w:t>树正则：num_leaves=31、min_child_samples=50、learning_rate=0.05、n_estimators=200；特征 1%/99% 分位缩尾。</w:t>
+      </w:r>
+    </w:p>
+    <w:p>
+      <w:pPr>
+        <w:pStyle w:val="ListBullet"/>
+      </w:pPr>
+      <w:r>
+        <w:rPr>
+          <w:rFonts w:ascii="Calibri" w:hAnsi="Calibri" w:eastAsia="微软雅黑" w:cs="Calibri"/>
+          <w:b w:val="0"/>
+          <w:i w:val="0"/>
+          <w:color w:val="212529"/>
+          <w:sz w:val="22"/>
+        </w:rPr>
+        <w:t>回测另加涨跌停/停牌/成本，禁止只用样本内曲线验收。</w:t>
+      </w:r>
+    </w:p>
+    <w:p>
+      <w:pPr>
+        <w:pStyle w:val="ListBullet"/>
+      </w:pPr>
+      <w:r>
+        <w:rPr>
+          <w:rFonts w:ascii="Calibri" w:hAnsi="Calibri" w:eastAsia="微软雅黑" w:cs="Calibri"/>
+          <w:b w:val="0"/>
+          <w:i w:val="0"/>
+          <w:color w:val="212529"/>
+          <w:sz w:val="22"/>
+        </w:rPr>
+        <w:t>挑战者（行业图注意力）同协议对比后未晋升：RankIC 更好但 Top-30 净收益更差。</w:t>
+      </w:r>
+    </w:p>
+    <w:p>
+      <w:pPr>
+        <w:pStyle w:val="ListBullet"/>
+      </w:pPr>
+      <w:r>
+        <w:rPr>
+          <w:rFonts w:ascii="Calibri" w:hAnsi="Calibri" w:eastAsia="微软雅黑" w:cs="Calibri"/>
+          <w:b w:val="0"/>
+          <w:i w:val="0"/>
+          <w:color w:val="212529"/>
+          <w:sz w:val="22"/>
+        </w:rPr>
+        <w:t>局限：最终生产模型用全历史拟合，OOS 数字来自折内模型；单一 walk-forward 路径、北交所小盘偏好。详见 phase1 报告第 6 节。</w:t>
+      </w:r>
+    </w:p>
+    <w:p>
+      <w:pPr>
         <w:pStyle w:val="Heading1"/>
       </w:pPr>
       <w:r>
@@ -2403,7 +2531,7 @@
                 <w:color w:val="FFFFFF"/>
                 <w:sz w:val="20"/>
               </w:rPr>
-              <w:t>DeepSeek（现状）</w:t>
+              <w:t>DeepSeek</w:t>
             </w:r>
           </w:p>
         </w:tc>
@@ -2428,7 +2556,7 @@
                 <w:color w:val="FFFFFF"/>
                 <w:sz w:val="20"/>
               </w:rPr>
-              <w:t>通义千问（DashScope）</w:t>
+              <w:t>通义千问（DashScope，当前默认）</w:t>
             </w:r>
           </w:p>
         </w:tc>
@@ -2478,7 +2606,7 @@
                 <w:color w:val="212529"/>
                 <w:sz w:val="20"/>
               </w:rPr>
-              <w:t>https://api.deepseek.com/chat/completions，OpenAI 兼容</w:t>
+              <w:t>OpenAI 兼容，api.deepseek.com</w:t>
             </w:r>
           </w:p>
         </w:tc>
@@ -2502,7 +2630,7 @@
                 <w:color w:val="212529"/>
                 <w:sz w:val="20"/>
               </w:rPr>
-              <w:t>https://dashscope.aliyuncs.com/compatible-mode/v1，同样兼容</w:t>
+              <w:t>OpenAI 兼容，dashscope.aliyuncs.com（当前默认）</w:t>
             </w:r>
           </w:p>
         </w:tc>
@@ -2579,7 +2707,7 @@
                 <w:color w:val="212529"/>
                 <w:sz w:val="20"/>
               </w:rPr>
-              <w:t>改 base_url、model、.env 键名、config.yaml</w:t>
+              <w:t>config.yaml 的 llm.provider=dashscope + DASHSCOPE_API_KEY</w:t>
             </w:r>
           </w:p>
         </w:tc>
@@ -2653,7 +2781,7 @@
                 <w:color w:val="212529"/>
                 <w:sz w:val="20"/>
               </w:rPr>
-              <w:t>说明文案通常更顺；Turbo/Plus/Max 可按成本换档</w:t>
+              <w:t>说明文案通常更顺；当前生产用 qwen-plus</w:t>
             </w:r>
           </w:p>
         </w:tc>
@@ -2705,7 +2833,7 @@
                 <w:color w:val="212529"/>
                 <w:sz w:val="20"/>
               </w:rPr>
-              <w:t>个人点选，月费可忽略</w:t>
+              <w:t>个人点选</w:t>
             </w:r>
           </w:p>
         </w:tc>
@@ -2730,7 +2858,7 @@
                 <w:color w:val="212529"/>
                 <w:sz w:val="20"/>
               </w:rPr>
-              <w:t>Turbo 适合摘要，正式说明可用 Plus</w:t>
+              <w:t>按阿里云百炼计费</w:t>
             </w:r>
           </w:p>
         </w:tc>
@@ -2780,7 +2908,7 @@
                 <w:color w:val="212529"/>
                 <w:sz w:val="20"/>
               </w:rPr>
-              <w:t>独立账号，故障面单一</w:t>
+              <w:t>独立账号</w:t>
             </w:r>
           </w:p>
         </w:tc>
@@ -2804,7 +2932,7 @@
                 <w:color w:val="212529"/>
                 <w:sz w:val="20"/>
               </w:rPr>
-              <w:t>阿里云企业合同、发票、地域更完整</w:t>
+              <w:t>阿里云企业合同、发票更完整</w:t>
             </w:r>
           </w:p>
         </w:tc>
@@ -2831,7 +2959,7 @@
                 <w:color w:val="212529"/>
                 <w:sz w:val="20"/>
               </w:rPr>
-              <w:t>本项目建议</w:t>
+              <w:t>本项目现状</w:t>
             </w:r>
           </w:p>
         </w:tc>
@@ -2856,7 +2984,7 @@
                 <w:color w:val="212529"/>
                 <w:sz w:val="20"/>
               </w:rPr>
-              <w:t>继续作为默认</w:t>
+              <w:t>曾为默认，已切换走</w:t>
             </w:r>
           </w:p>
         </w:tc>
@@ -2881,7 +3009,7 @@
                 <w:color w:val="212529"/>
                 <w:sz w:val="20"/>
               </w:rPr>
-              <w:t>仅在 DeepSeek 不可用或你要走阿里云账单时切换</w:t>
+              <w:t>2026-08-26 起为默认解释层</w:t>
             </w:r>
           </w:p>
         </w:tc>
@@ -2904,7 +3032,7 @@
           <w:color w:val="212529"/>
           <w:sz w:val="22"/>
         </w:rPr>
-        <w:t>建议维持 DeepSeek。解释质量的上限是输入质量（模型分数、因子、新闻标题），换一个同级中文模型几乎不会改变投资决策。若切换：抽象 _call_llm()，用 config.yaml 的 llm.provider 分支，不要复制一套 explain_assistant。价格与限流以官网当天页面为准，第三方博客数字不要写进生产配置。</w:t>
+        <w:t>当前默认是通义千问（DashScope / qwen-plus）。解释质量的上限是输入质量（模型分数、因子、新闻标题），换一个同级中文模型几乎不会改变投资决策。切换提供商：改 config.yaml 的 llm.provider 与 api_key_env，不要复制一套 explain_assistant。价格与限流以官网当天页面为准。</w:t>
       </w:r>
     </w:p>
     <w:tbl>
@@ -3555,7 +3683,7 @@
                 <w:color w:val="212529"/>
                 <w:sz w:val="20"/>
               </w:rPr>
-              <w:t>本机目录甚至可能无仓库</w:t>
+              <w:t>已推送 github.com/DomenRaven/yanheng（仓库级 user.name）</w:t>
             </w:r>
           </w:p>
         </w:tc>
@@ -3580,7 +3708,7 @@
                 <w:color w:val="212529"/>
                 <w:sz w:val="20"/>
               </w:rPr>
-              <w:t>企业审计默认有提交史；这是制度最大的落地缺口之一</w:t>
+              <w:t>无 CI；勿提交 .env / duckdb / exe</w:t>
             </w:r>
           </w:p>
         </w:tc>
@@ -3724,7 +3852,7 @@
           <w:color w:val="212529"/>
           <w:sz w:val="22"/>
         </w:rPr>
-        <w:t>权威数字以 stock-quant-system/docs/phase0~4-acceptance-report.md 为准，不要从聊天记录抄。修改手册后可运行：python -m scripts.build_manuals ，输出 docs/manuals/ 下两份 docx。</w:t>
+        <w:t>权威数字以 stock-quant-system/docs/phase0~4-acceptance-report.md 为准，不要从聊天记录抄。修改手册后可运行：python -m scripts.build_manuals ，输出 docs/manuals/ 下用户手册、开发者手册、人工可用性测试指南三份 docx。Agent 开发约束见仓库根目录 .cursor/skills/yanheng-dev-loop/ 。</w:t>
       </w:r>
     </w:p>
     <w:p>

</xml_diff>